<commit_message>
feat: migrate database to Supabase PostgreSQL, sync all tables, and update report author to Karthik V
</commit_message>
<xml_diff>
--- a/NMAMIT_Mentor_Mentee_Portal_Project_Report.docx
+++ b/NMAMIT_Mentor_Mentee_Portal_Project_Report.docx
@@ -6352,7 +6352,7 @@
                 <w:b/>
                 <w:sz w:val="20"/>
               </w:rPr>
-              <w:t>Student Name: Nihar K T</w:t>
+              <w:t>Student Name: Karthik V</w:t>
             </w:r>
           </w:p>
         </w:tc>
@@ -6372,7 +6372,7 @@
                 <w:b/>
                 <w:sz w:val="20"/>
               </w:rPr>
-              <w:t>Institutional Branch: Computer Science &amp; Engineering</w:t>
+              <w:t>Institutional Branch: Department of Information Science &amp; Engineering</w:t>
             </w:r>
           </w:p>
         </w:tc>
@@ -6394,7 +6394,7 @@
                 <w:b/>
                 <w:sz w:val="20"/>
               </w:rPr>
-              <w:t>University Seat Number (USN): NNM23IS109</w:t>
+              <w:t>University Seat Number (USN): NNM23IS086</w:t>
             </w:r>
           </w:p>
         </w:tc>
@@ -6456,7 +6456,7 @@
                 <w:b/>
                 <w:sz w:val="20"/>
               </w:rPr>
-              <w:t>Digital Signature: Nihar K T</w:t>
+              <w:t>Digital Signature: Karthik V</w:t>
             </w:r>
           </w:p>
         </w:tc>

</xml_diff>